<commit_message>
fix: logo PNG no contrato, sem laudo, campos dia/forma/extenso no formulario
</commit_message>
<xml_diff>
--- a/template_rt_aqua_v2_relatorio.docx
+++ b/template_rt_aqua_v2_relatorio.docx
@@ -537,7 +537,7 @@
           <w:sz w:val="20"/>
           <w:szCs w:val="20"/>
         </w:rPr>
-        <w:t xml:space="preserve">emissão de relatórios técnicos, relatórios, notificações de não conformidade, orientações técnicas e pareceres, nos padrões mínimos definidos no Anexo I deste contrato;</w:t>
+        <w:t xml:space="preserve">emissão de relatórios técnicos, notificações de não conformidade, orientações técnicas e pareceres, nos padrões mínimos definidos no Anexo I deste contrato;</w:t>
       </w:r>
     </w:p>
     <w:p>
@@ -863,7 +863,7 @@
           <w:sz w:val="20"/>
           <w:szCs w:val="20"/>
         </w:rPr>
-        <w:t xml:space="preserve">Os POPs, checklists, relatórios, notificações de não conformidade, orientações técnicas, relatórios e demais documentos técnicos emitidos pela CONTRATADA passam a integrar o presente contrato para todos os fins de direito, ainda que elaborados posteriormente à assinatura.</w:t>
+        <w:t xml:space="preserve">Os POPs, checklists, relatórios, notificações de não conformidade, orientações técnicas e demais documentos técnicos emitidos pela CONTRATADA passam a integrar o presente contrato para todos os fins de direito, ainda que elaborados posteriormente à assinatura.</w:t>
       </w:r>
     </w:p>
     <w:p>
@@ -1374,7 +1374,7 @@
           <w:sz w:val="20"/>
           <w:szCs w:val="20"/>
         </w:rPr>
-        <w:t xml:space="preserve">Pelos serviços ordinários objeto deste contrato, a CONTRATANTE pagará à CONTRATADA o valor mensal de R$ {{VALOR_MENSAL}} ({{VALOR_MENSAL_EXTENSO}}).</w:t>
+        <w:t xml:space="preserve">Pelos serviços ordinários objeto deste contrato, a CONTRATANTE pagará à CONTRATADA o valor mensal de {{VALOR_MENSAL}} ({{VALOR_MENSAL_EXTENSO}}).</w:t>
       </w:r>
     </w:p>
     <w:p>
@@ -1584,7 +1584,7 @@
           <w:sz w:val="20"/>
           <w:szCs w:val="20"/>
         </w:rPr>
-        <w:t xml:space="preserve">emissão de relatórios técnicos, relatórios ou pareceres extraordinários não compreendidos na rotina semanal;</w:t>
+        <w:t xml:space="preserve">emissão de relatórios técnicos adicionais ou pareceres extraordinários não compreendidos na rotina semanal;</w:t>
       </w:r>
     </w:p>
     <w:p>
@@ -2015,7 +2015,7 @@
           <w:sz w:val="20"/>
           <w:szCs w:val="20"/>
         </w:rPr>
-        <w:t xml:space="preserve">descumprimento de POPs, relatórios, relatórios ou orientações técnicas pela CONTRATANTE ou seus prepostos;</w:t>
+        <w:t xml:space="preserve">descumprimento de POPs, relatórios ou orientações técnicas pela CONTRATANTE ou seus prepostos;</w:t>
       </w:r>
     </w:p>
     <w:p>
@@ -3130,7 +3130,7 @@
           <w:sz w:val="20"/>
           <w:szCs w:val="20"/>
         </w:rPr>
-        <w:t xml:space="preserve">Para todos os fins de direito, serão considerados meios válidos de prova e comunicação: contratos, aditivos e anexos assinados fisicamente ou eletronicamente; relatórios, relatórios, POPs e notificações técnicas; e-mails corporativos; mensagens eletrônicas utilizadas no curso da relação contratual; registros fotográficos, vídeos e protocolos.</w:t>
+        <w:t xml:space="preserve">Para todos os fins de direito, serão considerados meios válidos de prova e comunicação: contratos, aditivos e anexos assinados fisicamente ou eletronicamente; relatórios, POPs e notificações técnicas; e-mails corporativos; mensagens eletrônicas utilizadas no curso da relação contratual; registros fotográficos, vídeos e protocolos.</w:t>
       </w:r>
     </w:p>
     <w:p>
@@ -3217,7 +3217,7 @@
           <w:sz w:val="20"/>
           <w:szCs w:val="20"/>
         </w:rPr>
-        <w:t xml:space="preserve">Em caso de divergência interpretativa, prevalecerá: contrato principal; aditivos; notificações formais; POPs e Anexos; relatórios e relatórios.</w:t>
+        <w:t xml:space="preserve">Em caso de divergência interpretativa, prevalecerá: contrato principal; aditivos; notificações formais; POPs e Anexos; relatórios e checklists.</w:t>
       </w:r>
     </w:p>
     <w:p>

</xml_diff>